<commit_message>
Contract template: drop the Mentor's citizenship and name from the public .docx
Co-Authored-By: Claude Sonnet 5.5 <noreply@anthropic.com>
</commit_message>
<xml_diff>
--- a/public/docs/dogovor-mentorstva-shablon.docx
+++ b/public/docs/dogovor-mentorstva-shablon.docx
@@ -178,7 +178,7 @@
         <w:rPr>
           <w:rFonts w:asciiTheme="minorHAnsi" w:hAnsiTheme="minorHAnsi" w:cstheme="minorHAnsi"/>
         </w:rPr>
-        <w:t xml:space="preserve">, далее именуемый(-ая) "Ментируемый", с одной стороны, и гражданин Республики Казахстан Иванов Богдан, применяющий специальный налоговый режим "Налог на профессиональный доход" (самозанятый), далее именуемый "Ментор", с другой стороны, совместно именуемые "Стороны", заключили настоящий договор (далее - Договор) о нижеследующем:</w:t>
+        <w:t xml:space="preserve">, далее именуемый(-ая) "Ментируемый", с одной стороны, и гражданин ____________ (Ф.И.О.), применяющий специальный налоговый режим "Налог на профессиональный доход" (самозанятый), далее именуемый "Ментор", с другой стороны, совместно именуемые "Стороны", заключили настоящий договор (далее - Договор) о нижеследующем:</w:t>
       </w:r>
     </w:p>
     <w:p>
@@ -2582,7 +2582,7 @@
               <w:rPr>
                 <w:rFonts w:asciiTheme="minorHAnsi" w:hAnsiTheme="minorHAnsi" w:cstheme="minorHAnsi"/>
               </w:rPr>
-              <w:t xml:space="preserve">Гражданин Республики Казахстан Иванов Богдан,</w:t>
+              <w:t xml:space="preserve">Гражданин ____________ (Ф.И.О.),</w:t>
             </w:r>
           </w:p>
           <w:p>

</xml_diff>